<commit_message>
Update CV files and modify download links for improved accessibility
</commit_message>
<xml_diff>
--- a/assets/cv/TianchuZeng-CV-ZH.docx
+++ b/assets/cv/TianchuZeng-CV-ZH.docx
@@ -10,6 +10,7 @@
           <w:rFonts w:hint="default"/>
         </w:rPr>
       </w:pPr>
+      <w:proofErr w:type="spellStart"/>
       <w:r>
         <w:rPr>
           <w:b/>
@@ -18,6 +19,7 @@
         </w:rPr>
         <w:t>曾天楚</w:t>
       </w:r>
+      <w:proofErr w:type="spellEnd"/>
     </w:p>
     <w:p>
       <w:pPr>
@@ -25,18 +27,86 @@
         <w:jc w:val="center"/>
         <w:rPr>
           <w:rFonts w:hint="default"/>
-        </w:rPr>
-      </w:pPr>
-      <w:r>
-        <w:rPr>
           <w:color w:val="5B6573"/>
           <w:sz w:val="20"/>
         </w:rPr>
+      </w:pPr>
+      <w:r>
+        <w:rPr>
+          <w:color w:val="5B6573"/>
+          <w:sz w:val="20"/>
+        </w:rPr>
         <w:t>Tianchu Zeng</w:t>
       </w:r>
     </w:p>
     <w:p>
       <w:pPr>
+        <w:spacing w:after="20" w:line="240" w:lineRule="auto"/>
+        <w:jc w:val="center"/>
+        <w:rPr>
+          <w:rFonts w:hint="default"/>
+          <w:lang w:eastAsia="zh-CN"/>
+        </w:rPr>
+      </w:pPr>
+      <w:r>
+        <w:rPr>
+          <w:rFonts w:ascii="宋体" w:eastAsia="宋体" w:hAnsi="宋体" w:cs="宋体"/>
+          <w:sz w:val="20"/>
+          <w:lang w:eastAsia="zh-CN"/>
+        </w:rPr>
+        <w:t>博士生</w:t>
+      </w:r>
+      <w:r>
+        <w:rPr>
+          <w:rFonts w:ascii="宋体" w:eastAsia="宋体" w:hAnsi="宋体" w:cs="宋体"/>
+          <w:sz w:val="20"/>
+          <w:lang w:eastAsia="zh-CN"/>
+        </w:rPr>
+        <w:t xml:space="preserve"> </w:t>
+      </w:r>
+      <w:r>
+        <w:rPr>
+          <w:rFonts w:eastAsia="宋体" w:cs="Arial"/>
+          <w:sz w:val="20"/>
+          <w:lang w:eastAsia="zh-CN"/>
+        </w:rPr>
+        <w:t>·</w:t>
+      </w:r>
+      <w:r>
+        <w:rPr>
+          <w:rFonts w:eastAsia="宋体" w:cs="Arial"/>
+          <w:sz w:val="20"/>
+          <w:lang w:eastAsia="zh-CN"/>
+        </w:rPr>
+        <w:t xml:space="preserve"> </w:t>
+      </w:r>
+      <w:r>
+        <w:rPr>
+          <w:rFonts w:ascii="宋体" w:eastAsia="宋体" w:hAnsi="宋体" w:cs="宋体"/>
+          <w:sz w:val="20"/>
+          <w:lang w:eastAsia="zh-CN"/>
+        </w:rPr>
+        <w:t>电子与计算机工程</w:t>
+      </w:r>
+      <w:r>
+        <w:rPr>
+          <w:rFonts w:cs="Arial"/>
+          <w:sz w:val="20"/>
+          <w:lang w:eastAsia="zh-CN"/>
+        </w:rPr>
+        <w:t xml:space="preserve"> · </w:t>
+      </w:r>
+      <w:r>
+        <w:rPr>
+          <w:rFonts w:ascii="宋体" w:eastAsia="宋体" w:hAnsi="宋体" w:cs="宋体"/>
+          <w:sz w:val="20"/>
+          <w:lang w:eastAsia="zh-CN"/>
+        </w:rPr>
+        <w:t>新加坡国立大学</w:t>
+      </w:r>
+    </w:p>
+    <w:p>
+      <w:pPr>
         <w:spacing w:after="16" w:line="240" w:lineRule="auto"/>
         <w:jc w:val="center"/>
         <w:rPr>
@@ -51,7 +121,7 @@
           <w:sz w:val="19"/>
           <w:lang w:eastAsia="zh-CN"/>
         </w:rPr>
-        <w:t>性别：男  ·  年龄：25岁  ·  +86 18960656288  ·  tianchuzeng@gmail.com</w:t>
+        <w:t>男  ·  25岁  ·  +86 18960656288  ·  tianchuzeng@gmail.com</w:t>
       </w:r>
     </w:p>
     <w:p>
@@ -162,7 +232,22 @@
           <w:color w:val="222222"/>
           <w:lang w:eastAsia="zh-CN"/>
         </w:rPr>
-        <w:t>新加坡国立大学电子与计算机工程博士生，研究方向为计算神经科学与科学智能（AI for Science），重点面向生物医学研究。研究包括利用人工智能（AI）加速生物物理脑模型拟合（第一作者论文与特邀研究简报均见于 Nature Methods）、提高 AI 模型评估的统计有效性，以及开展脑基础模型研究。具备从方法设计和大规模实验到可复现计算流程与开源软件实现的跨学科项目经验。</w:t>
+        <w:t>新加坡国立大学电子与计算机工程博士生，研究方向为计算神经科学与科学智能（AI for Science），重点面向生物医学研究。研究包括利用人工智能（AI）加速生物物理脑模型拟合（第一作者论文与特邀研究简报均</w:t>
+      </w:r>
+      <w:r>
+        <w:rPr>
+          <w:rFonts w:ascii="宋体" w:eastAsia="宋体" w:hAnsi="宋体" w:cs="宋体"/>
+          <w:color w:val="222222"/>
+          <w:lang w:eastAsia="zh-CN"/>
+        </w:rPr>
+        <w:t>接收</w:t>
+      </w:r>
+      <w:r>
+        <w:rPr>
+          <w:color w:val="222222"/>
+          <w:lang w:eastAsia="zh-CN"/>
+        </w:rPr>
+        <w:t>于 Nature Methods）、提高 AI 模型评估的统计有效性，以及开展脑基础模型研究。具备从方法设计和大规模实验到可复现计算流程与开源软件实现的跨学科项目经验。</w:t>
       </w:r>
     </w:p>
     <w:p>
@@ -191,7 +276,7 @@
       <w:pPr>
         <w:spacing w:after="32" w:line="250" w:lineRule="auto"/>
         <w:rPr>
-          <w:rFonts w:eastAsia="宋体"/>
+          <w:rFonts w:eastAsia="宋体" w:hint="default"/>
           <w:lang w:eastAsia="zh-CN"/>
         </w:rPr>
       </w:pPr>
@@ -340,8 +425,30 @@
         <w:rPr>
           <w:color w:val="222222"/>
         </w:rPr>
-        <w:t>BT Thomas Yeo 教授、Thomas E. Nichols 教授（牛津大学</w:t>
-      </w:r>
+        <w:t xml:space="preserve">BT Thomas Yeo </w:t>
+      </w:r>
+      <w:proofErr w:type="spellStart"/>
+      <w:r>
+        <w:rPr>
+          <w:color w:val="222222"/>
+        </w:rPr>
+        <w:t>教授、Thomas</w:t>
+      </w:r>
+      <w:proofErr w:type="spellEnd"/>
+      <w:r>
+        <w:rPr>
+          <w:color w:val="222222"/>
+        </w:rPr>
+        <w:t xml:space="preserve"> E. Nichols </w:t>
+      </w:r>
+      <w:proofErr w:type="spellStart"/>
+      <w:r>
+        <w:rPr>
+          <w:color w:val="222222"/>
+        </w:rPr>
+        <w:t>教授（牛津大学</w:t>
+      </w:r>
+      <w:proofErr w:type="spellEnd"/>
       <w:r>
         <w:rPr>
           <w:lang w:eastAsia="zh-CN"/>
@@ -358,11 +465,33 @@
           <w:rFonts w:hint="default"/>
         </w:rPr>
       </w:pPr>
-      <w:r>
-        <w:rPr>
-          <w:color w:val="222222"/>
-        </w:rPr>
-        <w:t>论文题目: AI for Brain Imaging（脑影像人工智能）</w:t>
+      <w:proofErr w:type="spellStart"/>
+      <w:r>
+        <w:rPr>
+          <w:color w:val="222222"/>
+        </w:rPr>
+        <w:t>论文题目</w:t>
+      </w:r>
+      <w:proofErr w:type="spellEnd"/>
+      <w:r>
+        <w:rPr>
+          <w:color w:val="222222"/>
+        </w:rPr>
+        <w:t xml:space="preserve">: AI for Brain </w:t>
+      </w:r>
+      <w:proofErr w:type="spellStart"/>
+      <w:r>
+        <w:rPr>
+          <w:color w:val="222222"/>
+        </w:rPr>
+        <w:t>Imaging（脑影像人工智能</w:t>
+      </w:r>
+      <w:proofErr w:type="spellEnd"/>
+      <w:r>
+        <w:rPr>
+          <w:color w:val="222222"/>
+        </w:rPr>
+        <w:t>）</w:t>
       </w:r>
     </w:p>
     <w:p>
@@ -724,7 +853,87 @@
           <w:sz w:val="15"/>
           <w:szCs w:val="17"/>
         </w:rPr>
-        <w:t>. 研究简报（Research Briefing，特邀），配合论文 [1]。已接收。</w:t>
+        <w:t xml:space="preserve">. </w:t>
+      </w:r>
+      <w:proofErr w:type="spellStart"/>
+      <w:r>
+        <w:rPr>
+          <w:bCs/>
+          <w:color w:val="222222"/>
+          <w:sz w:val="15"/>
+          <w:szCs w:val="17"/>
+        </w:rPr>
+        <w:t>研究简报（Research</w:t>
+      </w:r>
+      <w:proofErr w:type="spellEnd"/>
+      <w:r>
+        <w:rPr>
+          <w:bCs/>
+          <w:color w:val="222222"/>
+          <w:sz w:val="15"/>
+          <w:szCs w:val="17"/>
+        </w:rPr>
+        <w:t xml:space="preserve"> </w:t>
+      </w:r>
+      <w:proofErr w:type="spellStart"/>
+      <w:r>
+        <w:rPr>
+          <w:bCs/>
+          <w:color w:val="222222"/>
+          <w:sz w:val="15"/>
+          <w:szCs w:val="17"/>
+        </w:rPr>
+        <w:t>Briefing，特邀</w:t>
+      </w:r>
+      <w:proofErr w:type="spellEnd"/>
+      <w:r>
+        <w:rPr>
+          <w:bCs/>
+          <w:color w:val="222222"/>
+          <w:sz w:val="15"/>
+          <w:szCs w:val="17"/>
+        </w:rPr>
+        <w:t>），</w:t>
+      </w:r>
+      <w:proofErr w:type="spellStart"/>
+      <w:r>
+        <w:rPr>
+          <w:bCs/>
+          <w:color w:val="222222"/>
+          <w:sz w:val="15"/>
+          <w:szCs w:val="17"/>
+        </w:rPr>
+        <w:t>配合论文</w:t>
+      </w:r>
+      <w:proofErr w:type="spellEnd"/>
+      <w:r>
+        <w:rPr>
+          <w:bCs/>
+          <w:color w:val="222222"/>
+          <w:sz w:val="15"/>
+          <w:szCs w:val="17"/>
+        </w:rPr>
+        <w:t xml:space="preserve"> [1]。</w:t>
+      </w:r>
+      <w:proofErr w:type="spellStart"/>
+      <w:r>
+        <w:rPr>
+          <w:bCs/>
+          <w:color w:val="222222"/>
+          <w:sz w:val="15"/>
+          <w:szCs w:val="17"/>
+        </w:rPr>
+        <w:t>已接收</w:t>
+      </w:r>
+      <w:proofErr w:type="spellEnd"/>
+      <w:r>
+        <w:rPr>
+          <w:bCs/>
+          <w:color w:val="222222"/>
+          <w:sz w:val="15"/>
+          <w:szCs w:val="17"/>
+        </w:rPr>
+        <w:t>。</w:t>
       </w:r>
     </w:p>
     <w:p>
@@ -1166,7 +1375,25 @@
           <w:sz w:val="16"/>
           <w:lang w:eastAsia="zh-CN"/>
         </w:rPr>
-        <w:t>博士早期利用静息态 fMRI 开发群体水平与个体水平脑分区方法，并使用 MATLAB 和 FreeSurfer/Freeview 开展功能连接分析与皮层表面可视化。</w:t>
+        <w:t xml:space="preserve">博士早期利用静息态 fMRI 开发群体水平与个体水平脑分区方法，并使用 MATLAB 和 </w:t>
+      </w:r>
+      <w:proofErr w:type="spellStart"/>
+      <w:r>
+        <w:rPr>
+          <w:color w:val="222222"/>
+          <w:sz w:val="16"/>
+          <w:lang w:eastAsia="zh-CN"/>
+        </w:rPr>
+        <w:t>FreeSurfer</w:t>
+      </w:r>
+      <w:proofErr w:type="spellEnd"/>
+      <w:r>
+        <w:rPr>
+          <w:color w:val="222222"/>
+          <w:sz w:val="16"/>
+          <w:lang w:eastAsia="zh-CN"/>
+        </w:rPr>
+        <w:t>/Freeview 开展功能连接分析与皮层表面可视化。</w:t>
       </w:r>
     </w:p>
     <w:p>
@@ -1216,12 +1443,37 @@
           <w:rFonts w:hint="default"/>
         </w:rPr>
       </w:pPr>
+      <w:proofErr w:type="spellStart"/>
       <w:r>
         <w:rPr>
           <w:color w:val="222222"/>
           <w:sz w:val="16"/>
         </w:rPr>
-        <w:t>构建基于 RNN、GNN、CVAE 和 Transformer 的多智能体轨迹预测模型，并为北京冬奥会智能冬奥项目构建首钢园仿真数据集。</w:t>
+        <w:t>构建基于</w:t>
+      </w:r>
+      <w:proofErr w:type="spellEnd"/>
+      <w:r>
+        <w:rPr>
+          <w:color w:val="222222"/>
+          <w:sz w:val="16"/>
+        </w:rPr>
+        <w:t xml:space="preserve"> RNN、GNN、CVAE 和 Transformer </w:t>
+      </w:r>
+      <w:proofErr w:type="spellStart"/>
+      <w:r>
+        <w:rPr>
+          <w:color w:val="222222"/>
+          <w:sz w:val="16"/>
+        </w:rPr>
+        <w:t>的多智能体轨迹预测模型，并为北京冬奥会智能冬奥项目构建首钢园仿真数据集</w:t>
+      </w:r>
+      <w:proofErr w:type="spellEnd"/>
+      <w:r>
+        <w:rPr>
+          <w:color w:val="222222"/>
+          <w:sz w:val="16"/>
+        </w:rPr>
+        <w:t>。</w:t>
       </w:r>
     </w:p>
     <w:p>
@@ -1316,7 +1568,25 @@
           <w:sz w:val="16"/>
           <w:lang w:eastAsia="zh-CN"/>
         </w:rPr>
-        <w:t>作为组长，开发 DNA 加密/解密系统，将二进制数据编码为碱基序列并使用启发式搜索算法进行解码，预备参加iGEM竞赛（取消）。</w:t>
+        <w:t>作为组长，开发 DNA 加密/解密系统，将二进制数据编码为碱基序列并使用启发式搜索算法进行解码，预备参加</w:t>
+      </w:r>
+      <w:proofErr w:type="spellStart"/>
+      <w:r>
+        <w:rPr>
+          <w:color w:val="222222"/>
+          <w:sz w:val="16"/>
+          <w:lang w:eastAsia="zh-CN"/>
+        </w:rPr>
+        <w:t>iGEM</w:t>
+      </w:r>
+      <w:proofErr w:type="spellEnd"/>
+      <w:r>
+        <w:rPr>
+          <w:color w:val="222222"/>
+          <w:sz w:val="16"/>
+          <w:lang w:eastAsia="zh-CN"/>
+        </w:rPr>
+        <w:t>竞赛（取消）。</w:t>
       </w:r>
     </w:p>
     <w:p>
@@ -1621,12 +1891,37 @@
           <w:rFonts w:hint="default"/>
         </w:rPr>
       </w:pPr>
+      <w:proofErr w:type="spellStart"/>
       <w:r>
         <w:rPr>
           <w:color w:val="222222"/>
           <w:sz w:val="16"/>
         </w:rPr>
-        <w:t>参与面向供应商、零售商和代理机构的 Spring Boot 交易应用开发。</w:t>
+        <w:t>参与面向供应商、零售商和代理机构的</w:t>
+      </w:r>
+      <w:proofErr w:type="spellEnd"/>
+      <w:r>
+        <w:rPr>
+          <w:color w:val="222222"/>
+          <w:sz w:val="16"/>
+        </w:rPr>
+        <w:t xml:space="preserve"> Spring Boot </w:t>
+      </w:r>
+      <w:proofErr w:type="spellStart"/>
+      <w:r>
+        <w:rPr>
+          <w:color w:val="222222"/>
+          <w:sz w:val="16"/>
+        </w:rPr>
+        <w:t>交易应用开发</w:t>
+      </w:r>
+      <w:proofErr w:type="spellEnd"/>
+      <w:r>
+        <w:rPr>
+          <w:color w:val="222222"/>
+          <w:sz w:val="16"/>
+        </w:rPr>
+        <w:t>。</w:t>
       </w:r>
     </w:p>
     <w:p>
@@ -1668,6 +1963,7 @@
         </w:rPr>
         <w:t>荣誉</w:t>
       </w:r>
+      <w:proofErr w:type="spellStart"/>
       <w:r>
         <w:rPr>
           <w:b/>
@@ -1676,6 +1972,7 @@
         </w:rPr>
         <w:t>与学术活动</w:t>
       </w:r>
+      <w:proofErr w:type="spellEnd"/>
     </w:p>
     <w:p>
       <w:pPr>
@@ -1691,7 +1988,23 @@
           <w:color w:val="222222"/>
           <w:sz w:val="16"/>
         </w:rPr>
-        <w:t>NUHS Scientific and Innovation Summit 2026 基础科学最佳海报奖。</w:t>
+        <w:t xml:space="preserve">NUHS Scientific and Innovation Summit 2026 </w:t>
+      </w:r>
+      <w:proofErr w:type="spellStart"/>
+      <w:r>
+        <w:rPr>
+          <w:color w:val="222222"/>
+          <w:sz w:val="16"/>
+        </w:rPr>
+        <w:t>基础科学最佳海报奖</w:t>
+      </w:r>
+      <w:proofErr w:type="spellEnd"/>
+      <w:r>
+        <w:rPr>
+          <w:color w:val="222222"/>
+          <w:sz w:val="16"/>
+        </w:rPr>
+        <w:t>。</w:t>
       </w:r>
     </w:p>
     <w:p>
@@ -1741,8 +2054,17 @@
           <w:color w:val="222222"/>
           <w:sz w:val="16"/>
         </w:rPr>
-        <w:t xml:space="preserve"> 2025 特邀报告</w:t>
-      </w:r>
+        <w:t xml:space="preserve"> 2025 </w:t>
+      </w:r>
+      <w:proofErr w:type="spellStart"/>
+      <w:r>
+        <w:rPr>
+          <w:color w:val="222222"/>
+          <w:sz w:val="16"/>
+        </w:rPr>
+        <w:t>特邀报告</w:t>
+      </w:r>
+      <w:proofErr w:type="spellEnd"/>
     </w:p>
     <w:p>
       <w:pPr>
@@ -1758,7 +2080,23 @@
           <w:color w:val="222222"/>
           <w:sz w:val="16"/>
         </w:rPr>
-        <w:t>OHBM 2026、NUHS Scientific and Innovation Summit 2026、AI4X 2025 海报展示。</w:t>
+        <w:t xml:space="preserve">OHBM 2026、NUHS Scientific and Innovation Summit 2026、AI4X 2025 </w:t>
+      </w:r>
+      <w:proofErr w:type="spellStart"/>
+      <w:r>
+        <w:rPr>
+          <w:color w:val="222222"/>
+          <w:sz w:val="16"/>
+        </w:rPr>
+        <w:t>海报展示</w:t>
+      </w:r>
+      <w:proofErr w:type="spellEnd"/>
+      <w:r>
+        <w:rPr>
+          <w:color w:val="222222"/>
+          <w:sz w:val="16"/>
+        </w:rPr>
+        <w:t>。</w:t>
       </w:r>
     </w:p>
     <w:p>
@@ -1770,12 +2108,37 @@
           <w:rFonts w:hint="default"/>
         </w:rPr>
       </w:pPr>
+      <w:proofErr w:type="spellStart"/>
       <w:r>
         <w:rPr>
           <w:color w:val="222222"/>
           <w:sz w:val="16"/>
         </w:rPr>
-        <w:t>新加坡国立大学 EE2026 Digital Design、EE3731C Signal Processing 助教。</w:t>
+        <w:t>新加坡国立大学</w:t>
+      </w:r>
+      <w:proofErr w:type="spellEnd"/>
+      <w:r>
+        <w:rPr>
+          <w:color w:val="222222"/>
+          <w:sz w:val="16"/>
+        </w:rPr>
+        <w:t xml:space="preserve"> EE2026 Digital Design、EE3731C Signal Processing </w:t>
+      </w:r>
+      <w:proofErr w:type="spellStart"/>
+      <w:r>
+        <w:rPr>
+          <w:color w:val="222222"/>
+          <w:sz w:val="16"/>
+        </w:rPr>
+        <w:t>助教</w:t>
+      </w:r>
+      <w:proofErr w:type="spellEnd"/>
+      <w:r>
+        <w:rPr>
+          <w:color w:val="222222"/>
+          <w:sz w:val="16"/>
+        </w:rPr>
+        <w:t>。</w:t>
       </w:r>
     </w:p>
     <w:p>
@@ -1806,6 +2169,7 @@
           <w:rFonts w:hint="default"/>
         </w:rPr>
       </w:pPr>
+      <w:proofErr w:type="spellStart"/>
       <w:r>
         <w:rPr>
           <w:b/>
@@ -1814,6 +2178,7 @@
         </w:rPr>
         <w:t>专业技能</w:t>
       </w:r>
+      <w:proofErr w:type="spellEnd"/>
     </w:p>
     <w:p>
       <w:pPr>
@@ -1824,6 +2189,7 @@
           <w:rFonts w:hint="default"/>
         </w:rPr>
       </w:pPr>
+      <w:proofErr w:type="spellStart"/>
       <w:r>
         <w:rPr>
           <w:b/>
@@ -1837,7 +2203,31 @@
           <w:color w:val="222222"/>
           <w:sz w:val="16"/>
         </w:rPr>
-        <w:t>：Python、MATLAB、TypeScript/JavaScript、C、C++、Java</w:t>
+        <w:t>：Python、MATLAB、TypeScript</w:t>
+      </w:r>
+      <w:proofErr w:type="spellEnd"/>
+      <w:r>
+        <w:rPr>
+          <w:color w:val="222222"/>
+          <w:sz w:val="16"/>
+        </w:rPr>
+        <w:t>/</w:t>
+      </w:r>
+      <w:proofErr w:type="spellStart"/>
+      <w:r>
+        <w:rPr>
+          <w:color w:val="222222"/>
+          <w:sz w:val="16"/>
+        </w:rPr>
+        <w:t>JavaScript、C、C</w:t>
+      </w:r>
+      <w:proofErr w:type="spellEnd"/>
+      <w:r>
+        <w:rPr>
+          <w:color w:val="222222"/>
+          <w:sz w:val="16"/>
+        </w:rPr>
+        <w:t>++、Java</w:t>
       </w:r>
     </w:p>
     <w:p>
@@ -1865,7 +2255,25 @@
           <w:sz w:val="16"/>
           <w:lang w:eastAsia="zh-CN"/>
         </w:rPr>
-        <w:t>：PyTorch、JAX、scikit-learn、SciPy；深度学习、代理建模、数值优化、仿真</w:t>
+        <w:t>：</w:t>
+      </w:r>
+      <w:proofErr w:type="spellStart"/>
+      <w:r>
+        <w:rPr>
+          <w:color w:val="222222"/>
+          <w:sz w:val="16"/>
+          <w:lang w:eastAsia="zh-CN"/>
+        </w:rPr>
+        <w:t>PyTorch</w:t>
+      </w:r>
+      <w:proofErr w:type="spellEnd"/>
+      <w:r>
+        <w:rPr>
+          <w:color w:val="222222"/>
+          <w:sz w:val="16"/>
+          <w:lang w:eastAsia="zh-CN"/>
+        </w:rPr>
+        <w:t>、JAX、scikit-learn、SciPy；深度学习、代理建模、数值优化、仿真</w:t>
       </w:r>
     </w:p>
     <w:p>
@@ -1907,6 +2315,7 @@
           <w:rFonts w:hint="default"/>
         </w:rPr>
       </w:pPr>
+      <w:proofErr w:type="spellStart"/>
       <w:r>
         <w:rPr>
           <w:b/>
@@ -1922,7 +2331,34 @@
           <w:color w:val="222222"/>
           <w:sz w:val="16"/>
         </w:rPr>
-        <w:t>：静息态 fMRI 分析、功能连接分析、脑分区、皮层表面可视化；FreeSurfer/Freeview</w:t>
+        <w:t>：静息态</w:t>
+      </w:r>
+      <w:proofErr w:type="spellEnd"/>
+      <w:r>
+        <w:rPr>
+          <w:bCs/>
+          <w:color w:val="222222"/>
+          <w:sz w:val="16"/>
+        </w:rPr>
+        <w:t xml:space="preserve"> fMRI </w:t>
+      </w:r>
+      <w:proofErr w:type="spellStart"/>
+      <w:r>
+        <w:rPr>
+          <w:bCs/>
+          <w:color w:val="222222"/>
+          <w:sz w:val="16"/>
+        </w:rPr>
+        <w:t>分析、功能连接分析、脑分区、皮层表面可视化；FreeSurfer</w:t>
+      </w:r>
+      <w:proofErr w:type="spellEnd"/>
+      <w:r>
+        <w:rPr>
+          <w:bCs/>
+          <w:color w:val="222222"/>
+          <w:sz w:val="16"/>
+        </w:rPr>
+        <w:t>/Freeview</w:t>
       </w:r>
     </w:p>
     <w:p>
@@ -1964,21 +2400,41 @@
           <w:rFonts w:hint="default"/>
         </w:rPr>
       </w:pPr>
+      <w:proofErr w:type="spellStart"/>
       <w:r>
         <w:rPr>
           <w:b/>
           <w:color w:val="222222"/>
           <w:sz w:val="16"/>
         </w:rPr>
-        <w:t>软件与 Web 开发</w:t>
-      </w:r>
-      <w:r>
-        <w:rPr>
+        <w:t>软件与</w:t>
+      </w:r>
+      <w:proofErr w:type="spellEnd"/>
+      <w:r>
+        <w:rPr>
+          <w:b/>
           <w:color w:val="222222"/>
           <w:sz w:val="16"/>
         </w:rPr>
+        <w:t xml:space="preserve"> Web </w:t>
+      </w:r>
+      <w:proofErr w:type="spellStart"/>
+      <w:r>
+        <w:rPr>
+          <w:b/>
+          <w:color w:val="222222"/>
+          <w:sz w:val="16"/>
+        </w:rPr>
+        <w:t>开发</w:t>
+      </w:r>
+      <w:r>
+        <w:rPr>
+          <w:color w:val="222222"/>
+          <w:sz w:val="16"/>
+        </w:rPr>
         <w:t>：Node.js、React、Phaser、Vite、Zustand、Capacitor</w:t>
       </w:r>
+      <w:proofErr w:type="spellEnd"/>
     </w:p>
     <w:p>
       <w:pPr>
@@ -1989,6 +2445,7 @@
           <w:rFonts w:hint="default"/>
         </w:rPr>
       </w:pPr>
+      <w:proofErr w:type="spellStart"/>
       <w:r>
         <w:rPr>
           <w:b/>
@@ -1996,8 +2453,33 @@
         <w:t>科研基础设施</w:t>
       </w:r>
       <w:r>
-        <w:t>：Git、GitHub Actions、Linux/bash、HPC（PBS）、conda、Docker</w:t>
-      </w:r>
+        <w:t>：Git、GitHub</w:t>
+      </w:r>
+      <w:proofErr w:type="spellEnd"/>
+      <w:r>
+        <w:t xml:space="preserve"> </w:t>
+      </w:r>
+      <w:proofErr w:type="spellStart"/>
+      <w:r>
+        <w:t>Actions、Linux</w:t>
+      </w:r>
+      <w:proofErr w:type="spellEnd"/>
+      <w:r>
+        <w:t>/</w:t>
+      </w:r>
+      <w:proofErr w:type="spellStart"/>
+      <w:r>
+        <w:t>bash、HPC（PBS</w:t>
+      </w:r>
+      <w:proofErr w:type="spellEnd"/>
+      <w:r>
+        <w:t>）、</w:t>
+      </w:r>
+      <w:proofErr w:type="spellStart"/>
+      <w:r>
+        <w:t>conda、Docker</w:t>
+      </w:r>
+      <w:proofErr w:type="spellEnd"/>
     </w:p>
     <w:p>
       <w:pPr>
@@ -2008,6 +2490,7 @@
           <w:rFonts w:hint="default"/>
         </w:rPr>
       </w:pPr>
+      <w:proofErr w:type="spellStart"/>
       <w:r>
         <w:rPr>
           <w:b/>
@@ -2021,7 +2504,15 @@
           <w:color w:val="222222"/>
           <w:sz w:val="16"/>
         </w:rPr>
-        <w:t>：FPGA（Verilog、VHDL）</w:t>
+        <w:t>：FPGA（Verilog、VHDL</w:t>
+      </w:r>
+      <w:proofErr w:type="spellEnd"/>
+      <w:r>
+        <w:rPr>
+          <w:color w:val="222222"/>
+          <w:sz w:val="16"/>
+        </w:rPr>
+        <w:t>）</w:t>
       </w:r>
     </w:p>
     <w:p>

</xml_diff>